<commit_message>
Parecer PL 780/XVII: revisão da minuta de email à Diretora-Geral
Substitui o corpo do email pela versão fixada pelo autor, com o sentido
delimitado ao âmbito da competência: «não se identificam objeções
técnicas quanto ao bem-estar animal». Deixa de haver reserva quanto à
formulação jurídica da iniciativa.

Correções ao texto:
- «Concorrem» em lugar de «Concorre», por o sujeito ser composto;
- inversão do terceiro parágrafo, para que o «pelo que» ligue a exigência
  de prova vigente à falta de sanção, e não ao efeito útil da iniciativa;
- supressão da vírgula antes do «e» no paralelo de dois membros.

Gerado por gerar_email_dg.py. Uma página.

Co-Authored-By: Claude Opus 5 <noreply@anthropic.com>
Claude-Session: https://claude.ai/code/session_013o6nFXHLT8N1RQUQEcwmnG
</commit_message>
<xml_diff>
--- a/parecer PL780 zoofilia/Email_DG_PL780_XVII.docx
+++ b/parecer PL780 zoofilia/Email_DG_PL780_XVII.docx
@@ -64,7 +64,7 @@
           <w:color w:val="000000"/>
           <w:sz w:val="22"/>
         </w:rPr>
-        <w:t>Em resposta ao solicitado, junto o contributo sobre o Projeto de Lei n.º 780/XVII/2.ª, na parte que respeita ao bem-estar dos animais de companhia.</w:t>
+        <w:t>Em resposta ao solicitado, junta-se o contributo sobre o Projeto de Lei n.º 780/XVII/2.ª, no que respeita ao bem-estar dos animais de companhia.</w:t>
       </w:r>
     </w:p>
     <w:p>
@@ -77,7 +77,7 @@
           <w:color w:val="000000"/>
           <w:sz w:val="22"/>
         </w:rPr>
-        <w:t>A iniciativa altera o artigo 387.º do Código Penal e adita a alínea h) ao n.º 3 do artigo 1.º da Lei n.º 92/95, de 12 de setembro. Tipifica a ofensa sexual a animal, no plano penal quanto aos animais de companhia e no plano contraordenacional quanto a qualquer animal. A moldura penal mantém-se.</w:t>
+        <w:t>A iniciativa altera o artigo 387.º do Código Penal e adita a alínea h) ao n.º 3 do artigo 1.º da Lei n.º 92/95, de 12 de setembro. Tipifica a ofensa sexual a animal, no plano penal quanto aos animais de companhia e no plano contraordenacional quanto a qualquer animal.</w:t>
       </w:r>
     </w:p>
     <w:p>
@@ -90,7 +90,7 @@
           <w:color w:val="000000"/>
           <w:sz w:val="22"/>
         </w:rPr>
-        <w:t>O seu efeito útil é tornar a conduta punível sem prova de dor, sofrimento ou lesão. Hoje essa prova é exigida, tanto pelo n.º 3 do artigo 7.º do Decreto-Lei n.º 276/2001, de 17 de outubro, como pelo n.º 3 do artigo 387.º do Código Penal, pelo que o ato sexual de que não resulte sofrimento ou lesão demonstráveis não tem hoje sanção. É essa a lacuna que a iniciativa vem cobrir.</w:t>
+        <w:t>Tanto o n.º 3 do artigo 7.º do Decreto-Lei n.º 276/2001, de 17 de outubro, como o n.º 3 do artigo 387.º do Código Penal exigem a prova de dor, sofrimento ou lesão, pelo que a ofensa sexual de que não resulte sofrimento nem lesão demonstráveis não tem hoje sanção. O efeito útil da iniciativa é dispensar essa prova.</w:t>
       </w:r>
     </w:p>
     <w:p>
@@ -103,7 +103,7 @@
           <w:color w:val="000000"/>
           <w:sz w:val="22"/>
         </w:rPr>
-        <w:t>Concorre para a premência da alteração o impacto destas condutas no bem-estar animal e os riscos higiossanitários e zoonóticos associados, havendo ainda casuística de lesão por esta via em número não residual.</w:t>
+        <w:t>Concorrem para a premência da alteração o impacto destas condutas no bem-estar animal e os riscos higiossanitários e zoonóticos associados, havendo casuística de lesões por esta via em número não residual, nem sempre com evidência externa identificável.</w:t>
       </w:r>
     </w:p>
     <w:p>
@@ -116,7 +116,7 @@
           <w:color w:val="000000"/>
           <w:sz w:val="22"/>
         </w:rPr>
-        <w:t>O parecer é favorável e não se identificam objeções técnicas. Fica apenas por confirmar, em sede jurídica, a articulação do n.º 3 com o n.º 1 do artigo 1.º da Lei n.º 92/95 quanto ao alcance dos elementos limitadores, questão que se submete à apreciação dos serviços competentes.</w:t>
+        <w:t>Não se identificam objeções técnicas quanto ao bem-estar animal, pelo que o parecer é favorável.</w:t>
       </w:r>
     </w:p>
     <w:p>

</xml_diff>